<commit_message>
Alvará evento 30/10: retira nome da banda e medidas do palco do texto
Co-Authored-By: Claude Opus 5.5 <noreply@anthropic.com>
Claude-Session: https://claude.ai/code/session_01Xsu4psjqdzYnCKVsDP2B5y
</commit_message>
<xml_diff>
--- a/Alvará evento 30-10-2026 - Ronaldo de Lima Barbosa/Requerimento de alvará - evento 30-10-2026 - Ronaldo de Lima Barbosa.docx
+++ b/Alvará evento 30-10-2026 - Ronaldo de Lima Barbosa/Requerimento de alvará - evento 30-10-2026 - Ronaldo de Lima Barbosa.docx
@@ -206,29 +206,7 @@
         <w:t xml:space="preserve">Estrutura:</w:t>
       </w:r>
       <w:r>
-        <w:t xml:space="preserve"> palco provisório de </w:t>
-      </w:r>
-      <w:r>
-        <w:rPr>
-          <w:b/>
-          <w:bCs/>
-          <w:shd w:fill="FFF200" w:color="auto" w:val="clear"/>
-        </w:rPr>
-        <w:t xml:space="preserve">[__ m x __ m]</w:t>
-      </w:r>
-      <w:r>
-        <w:t xml:space="preserve">, sistema de som e iluminação e apresentação de 01 (uma) banda musical </w:t>
-      </w:r>
-      <w:r>
-        <w:rPr>
-          <w:b/>
-          <w:bCs/>
-          <w:shd w:fill="FFF200" w:color="auto" w:val="clear"/>
-        </w:rPr>
-        <w:t xml:space="preserve">[nome da banda]</w:t>
-      </w:r>
-      <w:r>
-        <w:t xml:space="preserve">;</w:t>
+        <w:t xml:space="preserve"> palco provisório, sistema de som e iluminação e apresentação de 01 (uma) banda musical, com dimensões e posicionamento indicados no croqui e no laudo técnico anexos;</w:t>
       </w:r>
     </w:p>
     <w:p>

</xml_diff>